<commit_message>
fix- Thay đổi format hợp đồng HP
</commit_message>
<xml_diff>
--- a/static/uploads/mau/hopdong/nt1/o3_tro_xuong/hdtv.docx
+++ b/static/uploads/mau/hopdong/nt1/o3_tro_xuong/hdtv.docx
@@ -307,7 +307,7 @@
                 <w:i/>
                 <w:szCs w:val="24"/>
               </w:rPr>
-              <w:t>{{ngay</w:t>
+              <w:t>{{</w:t>
             </w:r>
             <w:proofErr w:type="spellStart"/>
             <w:r>
@@ -317,6 +317,15 @@
                 <w:szCs w:val="24"/>
                 <w:lang w:val="en-US"/>
               </w:rPr>
+              <w:t>ngay</w:t>
+            </w:r>
+            <w:r>
+              <w:rPr>
+                <w:rFonts w:ascii="Times New Roman" w:hAnsi="Times New Roman"/>
+                <w:i/>
+                <w:szCs w:val="24"/>
+                <w:lang w:val="en-US"/>
+              </w:rPr>
               <w:t>lamhopdong</w:t>
             </w:r>
             <w:proofErr w:type="spellEnd"/>
@@ -355,7 +364,15 @@
                 <w:szCs w:val="24"/>
                 <w:lang w:val="en-US"/>
               </w:rPr>
-              <w:t xml:space="preserve"> {{</w:t>
+              <w:t xml:space="preserve"> </w:t>
+            </w:r>
+            <w:r>
+              <w:rPr>
+                <w:rFonts w:ascii="Times New Roman" w:hAnsi="Times New Roman"/>
+                <w:i/>
+                <w:szCs w:val="24"/>
+              </w:rPr>
+              <w:t>{{</w:t>
             </w:r>
             <w:proofErr w:type="spellStart"/>
             <w:r>
@@ -365,7 +382,16 @@
                 <w:szCs w:val="24"/>
                 <w:lang w:val="en-US"/>
               </w:rPr>
-              <w:t>thanglamhopdong</w:t>
+              <w:t>thang</w:t>
+            </w:r>
+            <w:r>
+              <w:rPr>
+                <w:rFonts w:ascii="Times New Roman" w:hAnsi="Times New Roman"/>
+                <w:i/>
+                <w:szCs w:val="24"/>
+                <w:lang w:val="en-US"/>
+              </w:rPr>
+              <w:t>lamhopdong</w:t>
             </w:r>
             <w:proofErr w:type="spellEnd"/>
             <w:r>
@@ -373,9 +399,17 @@
                 <w:rFonts w:ascii="Times New Roman" w:hAnsi="Times New Roman"/>
                 <w:i/>
                 <w:szCs w:val="24"/>
+              </w:rPr>
+              <w:t>}}</w:t>
+            </w:r>
+            <w:r>
+              <w:rPr>
+                <w:rFonts w:ascii="Times New Roman" w:hAnsi="Times New Roman"/>
+                <w:i/>
+                <w:szCs w:val="24"/>
                 <w:lang w:val="en-US"/>
               </w:rPr>
-              <w:t xml:space="preserve">}} </w:t>
+              <w:t xml:space="preserve"> </w:t>
             </w:r>
             <w:proofErr w:type="spellStart"/>
             <w:r>
@@ -395,7 +429,15 @@
                 <w:szCs w:val="24"/>
                 <w:lang w:val="en-US"/>
               </w:rPr>
-              <w:t xml:space="preserve"> {{</w:t>
+              <w:t xml:space="preserve"> </w:t>
+            </w:r>
+            <w:r>
+              <w:rPr>
+                <w:rFonts w:ascii="Times New Roman" w:hAnsi="Times New Roman"/>
+                <w:i/>
+                <w:szCs w:val="24"/>
+              </w:rPr>
+              <w:t>{{</w:t>
             </w:r>
             <w:proofErr w:type="spellStart"/>
             <w:r>
@@ -405,7 +447,25 @@
                 <w:szCs w:val="24"/>
                 <w:lang w:val="en-US"/>
               </w:rPr>
-              <w:t>namlamhopdong</w:t>
+              <w:t>n</w:t>
+            </w:r>
+            <w:r>
+              <w:rPr>
+                <w:rFonts w:ascii="Times New Roman" w:hAnsi="Times New Roman"/>
+                <w:i/>
+                <w:szCs w:val="24"/>
+                <w:lang w:val="en-US"/>
+              </w:rPr>
+              <w:t>am</w:t>
+            </w:r>
+            <w:r>
+              <w:rPr>
+                <w:rFonts w:ascii="Times New Roman" w:hAnsi="Times New Roman"/>
+                <w:i/>
+                <w:szCs w:val="24"/>
+                <w:lang w:val="en-US"/>
+              </w:rPr>
+              <w:t>lamhopdong</w:t>
             </w:r>
             <w:proofErr w:type="spellEnd"/>
             <w:r>
@@ -413,7 +473,6 @@
                 <w:rFonts w:ascii="Times New Roman" w:hAnsi="Times New Roman"/>
                 <w:i/>
                 <w:szCs w:val="24"/>
-                <w:lang w:val="en-US"/>
               </w:rPr>
               <w:t>}}</w:t>
             </w:r>
@@ -429,6 +488,7 @@
           <w:rFonts w:ascii="Times New Roman" w:hAnsi="Times New Roman"/>
           <w:sz w:val="28"/>
           <w:szCs w:val="24"/>
+          <w:lang w:val="en-US"/>
         </w:rPr>
       </w:pPr>
       <w:r>
@@ -437,7 +497,16 @@
           <w:sz w:val="28"/>
           <w:szCs w:val="24"/>
         </w:rPr>
-        <w:t>HỢP ĐỒNG LAO ĐỘNG</w:t>
+        <w:t xml:space="preserve">HỢP ĐỒNG </w:t>
+      </w:r>
+      <w:r>
+        <w:rPr>
+          <w:rFonts w:ascii="Times New Roman" w:hAnsi="Times New Roman"/>
+          <w:sz w:val="28"/>
+          <w:szCs w:val="24"/>
+          <w:lang w:val="en-US"/>
+        </w:rPr>
+        <w:t>THỬ VIỆC</w:t>
       </w:r>
     </w:p>
     <w:p>
@@ -7214,6 +7283,15 @@
   <wne:recipientData>
     <wne:active wne:val="1"/>
     <wne:hash wne:val="1707048493"/>
+  </wne:recipientData>
+  <wne:recipientData>
+    <wne:active wne:val="1"/>
+  </wne:recipientData>
+  <wne:recipientData>
+    <wne:active wne:val="1"/>
+  </wne:recipientData>
+  <wne:recipientData>
+    <wne:active wne:val="1"/>
   </wne:recipientData>
   <wne:recipientData>
     <wne:active wne:val="1"/>

</xml_diff>